<commit_message>
Reference PMI code D/FNS.2024-SKTP in letter
Co-Authored-By: Claude Sonnet 5.5 <noreply@anthropic.com>
Claude-Session: https://claude.ai/code/session_01P2FNmuhyC2BfiSd8rbtRh4
</commit_message>
<xml_diff>
--- a/out/Информационное_письмо_об_испытаниях_72ч.docx
+++ b/out/Информационное_письмо_об_испытаниях_72ч.docx
@@ -301,36 +301,7 @@
           <w:rFonts w:ascii="Times New Roman" w:hAnsi="Times New Roman"/>
           <w:sz w:val="24"/>
         </w:rPr>
-        <w:t>Документ № ______ от «__» ________ 2026 г., разработанный Подрядчиком и согласованный с Представителем Заказчика в соответствии с Техническим заданием, приёмо-сдаточное испытание под нагрузкой в течение 72 часов не включает. Испытания проведены в полном объёме, предусмотренном ПМИ.</w:t>
-      </w:r>
-    </w:p>
-    <w:p>
-      <w:pPr>
-        <w:spacing w:after="120" w:before="0" w:line="240" w:lineRule="auto"/>
-        <w:ind w:left="0" w:right="0" w:firstLine="709"/>
-        <w:jc w:val="both"/>
-      </w:pPr>
-      <w:r>
-        <w:rPr>
-          <w:rFonts w:ascii="Times New Roman" w:hAnsi="Times New Roman"/>
-          <w:sz w:val="24"/>
-        </w:rPr>
-        <w:t xml:space="preserve">4. </w:t>
-      </w:r>
-      <w:r>
-        <w:rPr>
-          <w:rFonts w:ascii="Times New Roman" w:hAnsi="Times New Roman"/>
-          <w:b/>
-          <w:sz w:val="24"/>
-        </w:rPr>
-        <w:t xml:space="preserve">Нормативные требования. </w:t>
-      </w:r>
-      <w:r>
-        <w:rPr>
-          <w:rFonts w:ascii="Times New Roman" w:hAnsi="Times New Roman"/>
-          <w:sz w:val="24"/>
-        </w:rPr>
-        <w:t>Объём и нормы приёмо-сдаточных испытаний электроустановок напряжением до 1 кВ установлены главой 1.8 Правил устройства электроустановок (7-е изд.) и приложением 3 к Правилам технической эксплуатации электроустановок потребителей (утв. приказом Минэнерго России от 12.08.2022 № 811). Для электропроводок и заземляющих устройств они предусматривают, в частности, измерение сопротивления изоляции и проверку параметров цепи «фаза–нуль» (сопротивления заземляющего устройства). Обязательное испытание таких электроустановок под нагрузкой в течение 72 часов указанными документами не установлено.</w:t>
+        <w:t>Испытания проводятся по ПМИ, разработанной Подрядчиком в соответствии с Техническим заданием. Для системы кондиционирования технологических помещений Технологической зоны №1 это «Программа и методика индивидуальных испытаний прецизионных кондиционеров серии XRow» (код документа Д/ФНС.2024-СКТП, 2026 г.): предварительная длительность испытаний составляет 4 (четыре) часа (п. 4.2 ПМИ), испытание под нагрузкой продолжительностью 72 часа в ней не предусмотрено. Объём испытаний электроустановок определён Техническим заданием и подтверждён протоколами, перечисленными ниже.</w:t>
       </w:r>
     </w:p>
     <w:p>
@@ -410,7 +381,7 @@
           <w:i w:val="0"/>
           <w:sz w:val="24"/>
         </w:rPr>
-        <w:t>На основании изложенного электроустановки Объекта испытаны в объёме, установленном Договором, Техническим заданием, ПМИ и действующими нормативными документами. Непроведение испытания под нагрузкой продолжительностью 72 часа не является нарушением условий выполнения работ.</w:t>
+        <w:t>На основании изложенного электроустановки Объекта испытаны в объёме, установленном Договором, Техническим заданием, ПМИ (код Д/ФНС.2024-СКТП) и действующими нормативными документами. Непроведение испытания под нагрузкой продолжительностью 72 часа не является нарушением условий выполнения работ.</w:t>
       </w:r>
     </w:p>
     <w:p>

</xml_diff>

<commit_message>
Rebuild letter on original template with signature and header preserved
Co-Authored-By: Claude Sonnet 5.5 <noreply@anthropic.com>
Claude-Session: https://claude.ai/code/session_01P2FNmuhyC2BfiSd8rbtRh4
</commit_message>
<xml_diff>
--- a/out/Информационное_письмо_об_испытаниях_72ч.docx
+++ b/out/Информационное_письмо_об_испытаниях_72ч.docx
@@ -4,495 +4,587 @@
   <w:body>
     <w:p>
       <w:pPr>
-        <w:spacing w:after="200" w:before="0" w:line="240" w:lineRule="auto"/>
-        <w:ind w:left="0" w:right="0" w:firstLine="0"/>
-        <w:jc w:val="left"/>
+        <w:keepNext w:val="0"/>
+        <w:keepLines w:val="0"/>
+        <w:pageBreakBefore w:val="0"/>
+        <w:widowControl w:val="0"/>
+        <w:pBdr>
+          <w:top w:space="0" w:sz="0" w:val="nil"/>
+          <w:left w:space="0" w:sz="0" w:val="nil"/>
+          <w:bottom w:space="0" w:sz="0" w:val="nil"/>
+          <w:right w:space="0" w:sz="0" w:val="nil"/>
+          <w:between w:space="0" w:sz="0" w:val="nil"/>
+        </w:pBdr>
+        <w:shd w:fill="auto" w:val="clear"/>
+        <w:spacing w:after="0" w:before="0" w:line="240" w:lineRule="auto"/>
+        <w:ind w:left="5787" w:right="0" w:firstLine="0"/>
+        <w:jc w:val="right"/>
+        <w:rPr>
+          <w:rFonts w:ascii="Times New Roman" w:cs="Times New Roman" w:eastAsia="Times New Roman" w:hAnsi="Times New Roman"/>
+          <w:b w:val="0"/>
+          <w:bCs w:val="0"/>
+          <w:i w:val="0"/>
+          <w:iCs w:val="0"/>
+          <w:smallCaps w:val="0"/>
+          <w:strike w:val="0"/>
+          <w:color w:val="000000"/>
+          <w:sz w:val="23"/>
+          <w:szCs w:val="23"/>
+          <w:u w:val="none"/>
+          <w:shd w:fill="auto" w:val="clear"/>
+          <w:vertAlign w:val="baseline"/>
+        </w:rPr>
       </w:pPr>
       <w:r>
         <w:rPr>
-          <w:rFonts w:ascii="Times New Roman" w:hAnsi="Times New Roman"/>
+          <w:rFonts w:ascii="Times New Roman" w:cs="Times New Roman" w:eastAsia="Times New Roman" w:hAnsi="Times New Roman"/>
           <w:b w:val="0"/>
+          <w:bCs w:val="0"/>
           <w:i w:val="0"/>
+          <w:iCs w:val="0"/>
+          <w:smallCaps w:val="0"/>
+          <w:strike w:val="0"/>
+          <w:color w:val="000000"/>
           <w:sz w:val="24"/>
-        </w:rPr>
-        <w:t>Исх. № ______ от «__» октября 2026 г.</w:t>
+          <w:szCs w:val="24"/>
+          <w:u w:val="none"/>
+          <w:shd w:fill="auto" w:val="clear"/>
+          <w:vertAlign w:val="baseline"/>
+          <w:rtl w:val="0"/>
+        </w:rPr>
+        <w:t xml:space="preserve">                                                                                  </w:t>
+      </w:r>
+      <w:r>
+        <w:rPr>
+          <w:rtl w:val="0"/>
+        </w:rPr>
       </w:r>
     </w:p>
     <w:p>
       <w:pPr>
-        <w:spacing w:after="0" w:before="0" w:line="240" w:lineRule="auto"/>
-        <w:ind w:left="0" w:right="0" w:firstLine="0"/>
-        <w:jc w:val="right"/>
+        <w:widowControl w:val="0"/>
+        <w:rPr>
+          <w:sz w:val="22"/>
+          <w:szCs w:val="22"/>
+        </w:rPr>
       </w:pPr>
       <w:r>
         <w:rPr>
-          <w:rFonts w:ascii="Times New Roman" w:hAnsi="Times New Roman"/>
-          <w:b w:val="0"/>
-          <w:i w:val="0"/>
-          <w:sz w:val="24"/>
-        </w:rPr>
-        <w:t>Директору филиала ФКУ</w:t>
+          <w:sz w:val="22"/>
+          <w:szCs w:val="22"/>
+          <w:rtl w:val="0"/>
+        </w:rPr>
+        <w:t>Исх. № б/н от 15.10.2026 г.</w:t>
       </w:r>
     </w:p>
     <w:p>
       <w:pPr>
-        <w:spacing w:after="0" w:before="0" w:line="240" w:lineRule="auto"/>
-        <w:ind w:left="0" w:right="0" w:firstLine="0"/>
+        <w:widowControl w:val="0"/>
+        <w:ind w:left="5780" w:firstLine="0"/>
         <w:jc w:val="right"/>
+        <w:rPr>
+          <w:sz w:val="24"/>
+          <w:szCs w:val="24"/>
+        </w:rPr>
       </w:pPr>
       <w:r>
         <w:rPr>
-          <w:rFonts w:ascii="Times New Roman" w:hAnsi="Times New Roman"/>
-          <w:b w:val="0"/>
-          <w:i w:val="0"/>
           <w:sz w:val="24"/>
-        </w:rPr>
-        <w:t>«Налог-Сервис» ФНС России по ЦОД в</w:t>
+          <w:szCs w:val="24"/>
+          <w:rtl w:val="0"/>
+        </w:rPr>
+        <w:t xml:space="preserve">                                                                                    </w:t>
       </w:r>
     </w:p>
     <w:p>
       <w:pPr>
-        <w:spacing w:after="0" w:before="0" w:line="240" w:lineRule="auto"/>
-        <w:ind w:left="0" w:right="0" w:firstLine="0"/>
+        <w:widowControl w:val="0"/>
+        <w:ind w:left="5780" w:firstLine="0"/>
         <w:jc w:val="right"/>
+        <w:rPr>
+          <w:sz w:val="24"/>
+          <w:szCs w:val="24"/>
+        </w:rPr>
       </w:pPr>
       <w:r>
         <w:rPr>
-          <w:rFonts w:ascii="Times New Roman" w:hAnsi="Times New Roman"/>
-          <w:b w:val="0"/>
-          <w:i w:val="0"/>
           <w:sz w:val="24"/>
-        </w:rPr>
-        <w:t>г. Дубна Московской области</w:t>
+          <w:szCs w:val="24"/>
+          <w:rtl w:val="0"/>
+        </w:rPr>
+        <w:t xml:space="preserve">Директору филиала ФКУ</w:t>
       </w:r>
     </w:p>
     <w:p>
       <w:pPr>
-        <w:spacing w:after="0" w:before="0" w:line="240" w:lineRule="auto"/>
-        <w:ind w:left="0" w:right="0" w:firstLine="0"/>
+        <w:widowControl w:val="0"/>
         <w:jc w:val="right"/>
+        <w:rPr>
+          <w:sz w:val="22"/>
+          <w:szCs w:val="22"/>
+        </w:rPr>
       </w:pPr>
       <w:r>
         <w:rPr>
-          <w:rFonts w:ascii="Times New Roman" w:hAnsi="Times New Roman"/>
-          <w:b w:val="0"/>
-          <w:i w:val="0"/>
-          <w:sz w:val="24"/>
-        </w:rPr>
-        <w:t>С. В. Астахову</w:t>
+          <w:sz w:val="22"/>
+          <w:szCs w:val="22"/>
+          <w:rtl w:val="0"/>
+        </w:rPr>
+        <w:t xml:space="preserve">«Налог-Сервис» ФНС России по ЦОД в</w:t>
       </w:r>
     </w:p>
     <w:p>
       <w:pPr>
-        <w:spacing w:after="0" w:before="0" w:line="240" w:lineRule="auto"/>
-        <w:ind w:left="0" w:right="0" w:firstLine="0"/>
+        <w:widowControl w:val="0"/>
         <w:jc w:val="right"/>
+        <w:rPr>
+          <w:sz w:val="22"/>
+          <w:szCs w:val="22"/>
+        </w:rPr>
       </w:pPr>
       <w:r>
         <w:rPr>
-          <w:rFonts w:ascii="Times New Roman" w:hAnsi="Times New Roman"/>
-          <w:b w:val="0"/>
-          <w:i w:val="0"/>
-          <w:sz w:val="24"/>
-        </w:rPr>
-        <w:t>Копия:</w:t>
+          <w:sz w:val="22"/>
+          <w:szCs w:val="22"/>
+          <w:rtl w:val="0"/>
+        </w:rPr>
+        <w:t xml:space="preserve">г. Дубна Московской области</w:t>
       </w:r>
     </w:p>
     <w:p>
       <w:pPr>
-        <w:spacing w:after="0" w:before="0" w:line="240" w:lineRule="auto"/>
-        <w:ind w:left="0" w:right="0" w:firstLine="0"/>
+        <w:widowControl w:val="0"/>
         <w:jc w:val="right"/>
+        <w:rPr>
+          <w:sz w:val="22"/>
+          <w:szCs w:val="22"/>
+        </w:rPr>
       </w:pPr>
       <w:r>
         <w:rPr>
-          <w:rFonts w:ascii="Times New Roman" w:hAnsi="Times New Roman"/>
-          <w:b w:val="0"/>
-          <w:i w:val="0"/>
-          <w:sz w:val="24"/>
-        </w:rPr>
-        <w:t>Руководителю дирекции проекта создания ЦОД</w:t>
+          <w:sz w:val="22"/>
+          <w:szCs w:val="22"/>
+          <w:rtl w:val="0"/>
+        </w:rPr>
+        <w:t xml:space="preserve"> С. В. Астахову</w:t>
       </w:r>
     </w:p>
     <w:p>
       <w:pPr>
-        <w:spacing w:after="0" w:before="0" w:line="240" w:lineRule="auto"/>
-        <w:ind w:left="0" w:right="0" w:firstLine="0"/>
+        <w:widowControl w:val="0"/>
         <w:jc w:val="right"/>
+        <w:rPr>
+          <w:sz w:val="22"/>
+          <w:szCs w:val="22"/>
+        </w:rPr>
       </w:pPr>
       <w:r>
         <w:rPr>
-          <w:rFonts w:ascii="Times New Roman" w:hAnsi="Times New Roman"/>
-          <w:b w:val="0"/>
-          <w:i w:val="0"/>
-          <w:sz w:val="24"/>
-        </w:rPr>
-        <w:t>ФКУ «Налог-Сервис» ФНС России</w:t>
+          <w:sz w:val="22"/>
+          <w:szCs w:val="22"/>
+          <w:rtl w:val="0"/>
+        </w:rPr>
+        <w:t xml:space="preserve">Копия:</w:t>
       </w:r>
     </w:p>
     <w:p>
       <w:pPr>
-        <w:spacing w:after="0" w:before="0" w:line="240" w:lineRule="auto"/>
-        <w:ind w:left="0" w:right="0" w:firstLine="0"/>
+        <w:widowControl w:val="0"/>
         <w:jc w:val="right"/>
+        <w:rPr>
+          <w:sz w:val="22"/>
+          <w:szCs w:val="22"/>
+        </w:rPr>
       </w:pPr>
       <w:r>
         <w:rPr>
-          <w:rFonts w:ascii="Times New Roman" w:hAnsi="Times New Roman"/>
-          <w:b w:val="0"/>
-          <w:i w:val="0"/>
-          <w:sz w:val="24"/>
-        </w:rPr>
-        <w:t>Виноградову С.Ю.</w:t>
+          <w:sz w:val="22"/>
+          <w:szCs w:val="22"/>
+          <w:rtl w:val="0"/>
+        </w:rPr>
+        <w:t xml:space="preserve">Руководителю дирекции проекта создания ЦОД</w:t>
       </w:r>
     </w:p>
     <w:p>
       <w:pPr>
-        <w:spacing w:after="120" w:before="0" w:line="240" w:lineRule="auto"/>
-        <w:ind w:left="0" w:right="0" w:firstLine="0"/>
-        <w:jc w:val="both"/>
-      </w:pPr>
-    </w:p>
-    <w:p>
-      <w:pPr>
-        <w:spacing w:after="200" w:before="0" w:line="240" w:lineRule="auto"/>
-        <w:ind w:left="850" w:right="850" w:firstLine="0"/>
-        <w:jc w:val="center"/>
+        <w:widowControl w:val="0"/>
+        <w:jc w:val="right"/>
+        <w:rPr>
+          <w:sz w:val="22"/>
+          <w:szCs w:val="22"/>
+        </w:rPr>
       </w:pPr>
       <w:r>
         <w:rPr>
-          <w:rFonts w:ascii="Times New Roman" w:hAnsi="Times New Roman"/>
-          <w:b/>
-          <w:i w:val="0"/>
-          <w:sz w:val="24"/>
-        </w:rPr>
-        <w:t>О порядке проведения испытаний электроустановок и об отсутствии испытания под нагрузкой продолжительностью 72 часа</w:t>
+          <w:sz w:val="22"/>
+          <w:szCs w:val="22"/>
+          <w:rtl w:val="0"/>
+        </w:rPr>
+        <w:t xml:space="preserve">ФКУ «Налог-Сервис» ФНС России</w:t>
       </w:r>
     </w:p>
     <w:p>
       <w:pPr>
-        <w:spacing w:after="160" w:before="0" w:line="240" w:lineRule="auto"/>
-        <w:ind w:left="0" w:right="0" w:firstLine="0"/>
-        <w:jc w:val="center"/>
+        <w:widowControl w:val="0"/>
+        <w:jc w:val="right"/>
+        <w:rPr>
+          <w:sz w:val="22"/>
+          <w:szCs w:val="22"/>
+        </w:rPr>
       </w:pPr>
       <w:r>
         <w:rPr>
-          <w:rFonts w:ascii="Times New Roman" w:hAnsi="Times New Roman"/>
-          <w:b/>
-          <w:i w:val="0"/>
-          <w:sz w:val="24"/>
-        </w:rPr>
-        <w:t>Уважаемый Сергей Валерьевич!</w:t>
+          <w:sz w:val="22"/>
+          <w:szCs w:val="22"/>
+          <w:rtl w:val="0"/>
+        </w:rPr>
+        <w:t xml:space="preserve">Виноградову С.Ю.</w:t>
       </w:r>
     </w:p>
     <w:p>
       <w:pPr>
-        <w:spacing w:after="120" w:before="0" w:line="240" w:lineRule="auto"/>
-        <w:ind w:left="0" w:right="0" w:firstLine="709"/>
-        <w:jc w:val="both"/>
+        <w:widowControl w:val="0"/>
+        <w:ind w:left="1020" w:right="1160" w:firstLine="0"/>
+        <w:jc w:val="center"/>
+        <w:rPr>
+          <w:b w:val="1"/>
+          <w:bCs w:val="1"/>
+          <w:sz w:val="24"/>
+          <w:szCs w:val="24"/>
+        </w:rPr>
       </w:pPr>
       <w:r>
         <w:rPr>
-          <w:rFonts w:ascii="Times New Roman" w:hAnsi="Times New Roman"/>
-          <w:b w:val="0"/>
-          <w:i w:val="0"/>
+          <w:b w:val="1"/>
+          <w:bCs w:val="1"/>
           <w:sz w:val="24"/>
-        </w:rPr>
-        <w:t>В рамках исполнения Государственного контракта № ГК-08-194/25 и Договора № ______ от «__» ________ 2026 г. ООО «ДИСИАЙ СОЛЮШНС» выполняет работы по модернизации системы бесперебойного электропитания технологической зоны (ТЗ) на объекте: Филиал ФКУ «Налог-Сервис» ФНС России по ЦОД в г. Дубна Московской области, 141981, Московская область, г. Дубна, ул. Технологическая, д. 2 (далее — Объект).</w:t>
+          <w:szCs w:val="24"/>
+          <w:rtl w:val="0"/>
+        </w:rPr>
+        <w:t xml:space="preserve">Уважаемый Сергей Валерьевич!</w:t>
       </w:r>
     </w:p>
     <w:p>
       <w:pPr>
-        <w:spacing w:after="120" w:before="0" w:line="240" w:lineRule="auto"/>
-        <w:ind w:left="0" w:right="0" w:firstLine="709"/>
+        <w:widowControl w:val="0"/>
+        <w:spacing w:after="80"/>
+        <w:ind w:firstLine="560"/>
         <w:jc w:val="both"/>
+        <w:rPr>
+          <w:sz w:val="24"/>
+          <w:szCs w:val="24"/>
+        </w:rPr>
       </w:pPr>
       <w:r>
         <w:rPr>
-          <w:rFonts w:ascii="Times New Roman" w:hAnsi="Times New Roman"/>
-          <w:b w:val="0"/>
-          <w:i w:val="0"/>
           <w:sz w:val="24"/>
-        </w:rPr>
-        <w:t>Информируем, что по электроустановкам и кабельным линиям Объекта проведены приёмо-сдаточные испытания, а испытание под нагрузкой продолжительностью 72 часа не проводилось, поскольку такое испытание не предусмотрено условиями выполнения работ. Основания:</w:t>
+          <w:szCs w:val="24"/>
+          <w:rtl w:val="0"/>
+        </w:rPr>
+        <w:t xml:space="preserve">Настоящим информируем, что в ходе выполнения работ по модернизации системы бесперебойного электропитания технологической зоны на объекте Филиала ФКУ «Налог-Сервис» ФНС России по ЦОД в г. Дубна (Государственный контракт № ГК-08-194/25 от 29.01.2026) приёмо-сдаточные испытания электроустановок проведены, а испытание под нагрузкой продолжительностью 72 часа не проводилось, так как оно не предусмотрено условиями выполнения работ. Основания:</w:t>
       </w:r>
     </w:p>
     <w:p>
       <w:pPr>
-        <w:spacing w:after="120" w:before="0" w:line="240" w:lineRule="auto"/>
-        <w:ind w:left="0" w:right="0" w:firstLine="709"/>
+        <w:widowControl w:val="0"/>
+        <w:spacing w:after="80"/>
+        <w:ind w:firstLine="560"/>
         <w:jc w:val="both"/>
+        <w:rPr>
+          <w:sz w:val="24"/>
+          <w:szCs w:val="24"/>
+        </w:rPr>
       </w:pPr>
       <w:r>
         <w:rPr>
-          <w:rFonts w:ascii="Times New Roman" w:hAnsi="Times New Roman"/>
+          <w:b/>
           <w:sz w:val="24"/>
-        </w:rPr>
-        <w:t xml:space="preserve">1. </w:t>
+          <w:szCs w:val="24"/>
+          <w:rtl w:val="0"/>
+        </w:rPr>
+        <w:t xml:space="preserve">1. Контракт и договор.</w:t>
       </w:r>
       <w:r>
         <w:rPr>
-          <w:rFonts w:ascii="Times New Roman" w:hAnsi="Times New Roman"/>
-          <w:b/>
           <w:sz w:val="24"/>
-        </w:rPr>
-        <w:t xml:space="preserve">Договор. </w:t>
-      </w:r>
-      <w:r>
-        <w:rPr>
-          <w:rFonts w:ascii="Times New Roman" w:hAnsi="Times New Roman"/>
-          <w:sz w:val="24"/>
-        </w:rPr>
-        <w:t>Договор № ______ и приложения к нему не устанавливают обязанность Подрядчика провести испытание электроустановок под нагрузкой в течение 72 часов, а также критерии и порядок приёмки по его результатам.</w:t>
+          <w:szCs w:val="24"/>
+          <w:rtl w:val="0"/>
+        </w:rPr>
+        <w:t xml:space="preserve"> Контракт и договорная документация по нему не устанавливают обязанность Подрядчика проводить испытание электроустановок под нагрузкой в течение 72 часов, а также критерии и порядок приёмки по его результатам.</w:t>
       </w:r>
     </w:p>
     <w:p>
       <w:pPr>
-        <w:spacing w:after="120" w:before="0" w:line="240" w:lineRule="auto"/>
-        <w:ind w:left="0" w:right="0" w:firstLine="709"/>
+        <w:widowControl w:val="0"/>
+        <w:spacing w:after="80"/>
+        <w:ind w:firstLine="560"/>
         <w:jc w:val="both"/>
+        <w:rPr>
+          <w:sz w:val="24"/>
+          <w:szCs w:val="24"/>
+        </w:rPr>
       </w:pPr>
       <w:r>
         <w:rPr>
-          <w:rFonts w:ascii="Times New Roman" w:hAnsi="Times New Roman"/>
+          <w:b/>
           <w:sz w:val="24"/>
-        </w:rPr>
-        <w:t xml:space="preserve">2. </w:t>
+          <w:szCs w:val="24"/>
+          <w:rtl w:val="0"/>
+        </w:rPr>
+        <w:t xml:space="preserve">2. Техническое задание (Приложение № 1 к договору).</w:t>
       </w:r>
       <w:r>
         <w:rPr>
-          <w:rFonts w:ascii="Times New Roman" w:hAnsi="Times New Roman"/>
-          <w:b/>
           <w:sz w:val="24"/>
-        </w:rPr>
-        <w:t xml:space="preserve">Техническое задание (Приложение № 1 к Договору). </w:t>
-      </w:r>
-      <w:r>
-        <w:rPr>
-          <w:rFonts w:ascii="Times New Roman" w:hAnsi="Times New Roman"/>
-          <w:sz w:val="24"/>
-        </w:rPr>
-        <w:t>Раздел «Требования к порядку и качеству производства монтажных и пусконаладочных работ» определяет состав испытаний по разделу «Система электроснабжения»: лабораторные испытания электроустановок и кабельных линий, а также пусконаладочные работы на вновь установленных источниках бесперебойного питания с применением резистивных нагрузочных модулей соответствующей номинальной мощности. Продолжительность испытаний под нагрузкой в 72 часа в Техническом задании не установлена. Результатом испытаний электроустановки является технический отчёт (раздел «Состав передаваемой документации» Технического задания).</w:t>
+          <w:szCs w:val="24"/>
+          <w:rtl w:val="0"/>
+        </w:rPr>
+        <w:t xml:space="preserve"> В разделе «Требования к порядку и качеству производства монтажных и пусконаладочных работ» состав испытаний по разделу «Система электроснабжения» определён как лабораторные испытания электроустановок и кабельных линий и пусконаладочные работы на вновь установленных источниках бесперебойного питания с применением резистивных нагрузочных модулей соответствующей номинальной мощности. Продолжительность испытаний под нагрузкой в 72 часа в Техническом задании не установлена. Результатом испытаний электроустановки является технический отчёт.</w:t>
       </w:r>
     </w:p>
     <w:p>
       <w:pPr>
-        <w:spacing w:after="120" w:before="0" w:line="240" w:lineRule="auto"/>
-        <w:ind w:left="0" w:right="0" w:firstLine="709"/>
+        <w:widowControl w:val="0"/>
+        <w:spacing w:after="80"/>
+        <w:ind w:firstLine="560"/>
         <w:jc w:val="both"/>
+        <w:rPr>
+          <w:sz w:val="24"/>
+          <w:szCs w:val="24"/>
+        </w:rPr>
       </w:pPr>
       <w:r>
         <w:rPr>
-          <w:rFonts w:ascii="Times New Roman" w:hAnsi="Times New Roman"/>
+          <w:b/>
           <w:sz w:val="24"/>
-        </w:rPr>
-        <w:t xml:space="preserve">3. </w:t>
+          <w:szCs w:val="24"/>
+          <w:rtl w:val="0"/>
+        </w:rPr>
+        <w:t xml:space="preserve">3. Программа и методика испытаний (ПМИ).</w:t>
       </w:r>
       <w:r>
         <w:rPr>
-          <w:rFonts w:ascii="Times New Roman" w:hAnsi="Times New Roman"/>
-          <w:b/>
           <w:sz w:val="24"/>
-        </w:rPr>
-        <w:t xml:space="preserve">Программа и методика испытаний (ПМИ). </w:t>
-      </w:r>
-      <w:r>
-        <w:rPr>
-          <w:rFonts w:ascii="Times New Roman" w:hAnsi="Times New Roman"/>
-          <w:sz w:val="24"/>
-        </w:rPr>
-        <w:t>Испытания проводятся по ПМИ, разработанной Подрядчиком в соответствии с Техническим заданием. Для системы кондиционирования технологических помещений Технологической зоны №1 это «Программа и методика индивидуальных испытаний прецизионных кондиционеров серии XRow» (код документа Д/ФНС.2024-СКТП, 2026 г.): предварительная длительность испытаний составляет 4 (четыре) часа (п. 4.2 ПМИ), испытание под нагрузкой продолжительностью 72 часа в ней не предусмотрено. Объём испытаний электроустановок определён Техническим заданием и подтверждён протоколами, перечисленными ниже.</w:t>
+          <w:szCs w:val="24"/>
+          <w:rtl w:val="0"/>
+        </w:rPr>
+        <w:t xml:space="preserve"> Испытания проводятся по ПМИ, разработанным Подрядчиком в соответствии с Техническим заданием. Для системы кондиционирования технологических помещений Технологической зоны №1 это «Программа и методика индивидуальных испытаний прецизионных кондиционеров серии XRow» (код документа Д/ФНС.2024-СКТП): предварительная длительность испытаний составляет 4 (четыре) часа (п. 4.2), испытание под нагрузкой продолжительностью 72 часа не предусмотрено.</w:t>
       </w:r>
     </w:p>
     <w:p>
       <w:pPr>
-        <w:spacing w:after="120" w:before="0" w:line="240" w:lineRule="auto"/>
-        <w:ind w:left="0" w:right="0" w:firstLine="709"/>
+        <w:widowControl w:val="0"/>
+        <w:spacing w:after="80"/>
+        <w:ind w:firstLine="560"/>
         <w:jc w:val="both"/>
+        <w:rPr>
+          <w:sz w:val="24"/>
+          <w:szCs w:val="24"/>
+        </w:rPr>
       </w:pPr>
       <w:r>
         <w:rPr>
-          <w:rFonts w:ascii="Times New Roman" w:hAnsi="Times New Roman"/>
-          <w:b w:val="0"/>
-          <w:i w:val="0"/>
+          <w:b/>
           <w:sz w:val="24"/>
-        </w:rPr>
-        <w:t>Фактически выполненные испытания подтверждаются протоколами:</w:t>
+          <w:szCs w:val="24"/>
+          <w:rtl w:val="0"/>
+        </w:rPr>
+        <w:t xml:space="preserve">4. Нормативные требования.</w:t>
+      </w:r>
+      <w:r>
+        <w:rPr>
+          <w:sz w:val="24"/>
+          <w:szCs w:val="24"/>
+          <w:rtl w:val="0"/>
+        </w:rPr>
+        <w:t xml:space="preserve"> Объём и нормы приёмо-сдаточных испытаний электроустановок напряжением до 1 кВ установлены главой 1.8 ПУЭ (7-е изд.) и приложением 3 к Правилам технической эксплуатации электроустановок потребителей (утв. приказом Минэнерго России от 12.08.2022 № 811). Они предусматривают, в частности, измерение сопротивления изоляции и проверку параметров цепи «фаза–нуль» (заземляющих устройств). Обязательного испытания таких электроустановок под нагрузкой в течение 72 часов указанные документы не устанавливают.</w:t>
       </w:r>
     </w:p>
     <w:p>
       <w:pPr>
-        <w:spacing w:after="60" w:before="0" w:line="240" w:lineRule="auto"/>
-        <w:ind w:left="709" w:right="0" w:firstLine="0"/>
+        <w:widowControl w:val="0"/>
+        <w:spacing w:after="80"/>
+        <w:ind w:firstLine="560"/>
         <w:jc w:val="both"/>
+        <w:rPr>
+          <w:sz w:val="24"/>
+          <w:szCs w:val="24"/>
+        </w:rPr>
       </w:pPr>
       <w:r>
         <w:rPr>
-          <w:rFonts w:ascii="Times New Roman" w:hAnsi="Times New Roman"/>
-          <w:b w:val="0"/>
-          <w:i w:val="0"/>
           <w:sz w:val="24"/>
-        </w:rPr>
-        <w:t>— протокол № ______ от «__» ________ 2026 г. — измерение сопротивления изоляции;</w:t>
+          <w:szCs w:val="24"/>
+          <w:rtl w:val="0"/>
+        </w:rPr>
+        <w:t xml:space="preserve">Выполненные испытания подтверждаются протоколами измерения сопротивления изоляции № ____ от __.__.2026 г. и измерения сопротивления № ____ от __.__.2026 г. (копии прилагаются); результаты соответствуют нормируемым значениям. Пусконаладочные работы на источниках бесперебойного питания проведены с применением резистивных нагрузочных модулей в соответствии с Техническим заданием.</w:t>
       </w:r>
     </w:p>
     <w:p>
       <w:pPr>
-        <w:spacing w:after="60" w:before="0" w:line="240" w:lineRule="auto"/>
-        <w:ind w:left="709" w:right="0" w:firstLine="0"/>
+        <w:widowControl w:val="0"/>
+        <w:spacing w:after="80"/>
+        <w:ind w:firstLine="560"/>
         <w:jc w:val="both"/>
+        <w:rPr>
+          <w:sz w:val="24"/>
+          <w:szCs w:val="24"/>
+        </w:rPr>
       </w:pPr>
       <w:r>
         <w:rPr>
-          <w:rFonts w:ascii="Times New Roman" w:hAnsi="Times New Roman"/>
-          <w:b w:val="0"/>
-          <w:i w:val="0"/>
           <w:sz w:val="24"/>
-        </w:rPr>
-        <w:t>— протокол № ______ от «__» ________ 2026 г. — измерение сопротивления (цепи «фаза–нуль» / заземляющего устройства — указать нужное).</w:t>
+          <w:szCs w:val="24"/>
+          <w:rtl w:val="0"/>
+        </w:rPr>
+        <w:t xml:space="preserve">На основании изложенного электроустановки Объекта испытаны в объёме, установленном Контрактом, Техническим заданием, ПМИ и действующими нормативными документами. Непроведение испытания под нагрузкой продолжительностью 72 часа не является нарушением условий выполнения работ. Если проведение такого испытания Вы считаете необходимым, просим направить письменное требование с указанием основания (пункт договора, проекта или технических условий); срок и условия его проведения будут согласованы дополнительно.</w:t>
       </w:r>
     </w:p>
     <w:p>
       <w:pPr>
-        <w:spacing w:after="120" w:before="0" w:line="240" w:lineRule="auto"/>
-        <w:ind w:left="0" w:right="0" w:firstLine="709"/>
+        <w:widowControl w:val="0"/>
+        <w:spacing w:after="80"/>
+        <w:ind w:left="0"/>
         <w:jc w:val="both"/>
+        <w:rPr>
+          <w:sz w:val="24"/>
+          <w:szCs w:val="24"/>
+        </w:rPr>
       </w:pPr>
       <w:r>
         <w:rPr>
-          <w:rFonts w:ascii="Times New Roman" w:hAnsi="Times New Roman"/>
-          <w:b w:val="0"/>
-          <w:i w:val="0"/>
           <w:sz w:val="24"/>
-        </w:rPr>
-        <w:t>Измерения выполнены поверенными средствами измерений (свидетельство о поверке № ______ от «__» ________ 20__ г.), результаты соответствуют нормируемым значениям. Пусконаладочные работы на источниках бесперебойного питания проведены с применением резистивных нагрузочных модулей в соответствии с Техническим заданием, что подтверждается актами и протоколами ПНР.</w:t>
+          <w:szCs w:val="24"/>
+          <w:rtl w:val="0"/>
+        </w:rPr>
+        <w:t xml:space="preserve">Приложение: протоколы испытаний на ___ л. в 1 экз.</w:t>
       </w:r>
     </w:p>
     <w:p>
       <w:pPr>
-        <w:spacing w:after="120" w:before="0" w:line="240" w:lineRule="auto"/>
-        <w:ind w:left="0" w:right="0" w:firstLine="709"/>
-        <w:jc w:val="both"/>
+        <w:keepNext w:val="0"/>
+        <w:keepLines w:val="0"/>
+        <w:pageBreakBefore w:val="0"/>
+        <w:widowControl w:val="0"/>
+        <w:pBdr>
+          <w:top w:space="0" w:sz="0" w:val="nil"/>
+          <w:left w:space="0" w:sz="0" w:val="nil"/>
+          <w:bottom w:space="0" w:sz="0" w:val="nil"/>
+          <w:right w:space="0" w:sz="0" w:val="nil"/>
+          <w:between w:space="0" w:sz="0" w:val="nil"/>
+        </w:pBdr>
+        <w:shd w:fill="auto" w:val="clear"/>
+        <w:spacing w:after="0" w:before="1" w:line="240" w:lineRule="auto"/>
+        <w:ind w:left="252" w:right="103" w:hanging="252"/>
+        <w:jc w:val="left"/>
+        <w:rPr>
+          <w:rFonts w:ascii="Times New Roman" w:cs="Times New Roman" w:eastAsia="Times New Roman" w:hAnsi="Times New Roman"/>
+          <w:b w:val="0"/>
+          <w:bCs w:val="0"/>
+          <w:i w:val="0"/>
+          <w:iCs w:val="0"/>
+          <w:smallCaps w:val="0"/>
+          <w:strike w:val="0"/>
+          <w:color w:val="000000"/>
+          <w:sz w:val="23"/>
+          <w:szCs w:val="23"/>
+          <w:u w:val="none"/>
+          <w:shd w:fill="auto" w:val="clear"/>
+          <w:vertAlign w:val="baseline"/>
+        </w:rPr>
       </w:pPr>
       <w:r>
         <w:rPr>
-          <w:rFonts w:ascii="Times New Roman" w:hAnsi="Times New Roman"/>
+          <w:rFonts w:ascii="Times New Roman" w:cs="Times New Roman" w:eastAsia="Times New Roman" w:hAnsi="Times New Roman"/>
           <w:b w:val="0"/>
+          <w:bCs w:val="0"/>
           <w:i w:val="0"/>
-          <w:sz w:val="24"/>
-        </w:rPr>
-        <w:t>На основании изложенного электроустановки Объекта испытаны в объёме, установленном Договором, Техническим заданием, ПМИ (код Д/ФНС.2024-СКТП) и действующими нормативными документами. Непроведение испытания под нагрузкой продолжительностью 72 часа не является нарушением условий выполнения работ.</w:t>
+          <w:iCs w:val="0"/>
+          <w:smallCaps w:val="0"/>
+          <w:strike w:val="0"/>
+          <w:color w:val="000000"/>
+          <w:sz w:val="22"/>
+          <w:szCs w:val="22"/>
+          <w:u w:val="none"/>
+          <w:shd w:fill="auto" w:val="clear"/>
+          <w:vertAlign w:val="baseline"/>
+        </w:rPr>
+        <w:drawing>
+          <wp:inline distB="0" distT="0" distL="114300" distR="114300">
+            <wp:extent cx="3845560" cy="911225"/>
+            <wp:effectExtent b="0" l="0" r="0" t="0"/>
+            <wp:docPr id="1049" name="image3.jpg"/>
+            <a:graphic>
+              <a:graphicData uri="http://schemas.openxmlformats.org/drawingml/2006/picture">
+                <pic:pic>
+                  <pic:nvPicPr>
+                    <pic:cNvPr id="0" name="image3.jpg"/>
+                    <pic:cNvPicPr preferRelativeResize="0"/>
+                  </pic:nvPicPr>
+                  <pic:blipFill>
+                    <a:blip r:embed="rId7"/>
+                    <a:srcRect b="0" l="0" r="0" t="0"/>
+                    <a:stretch>
+                      <a:fillRect/>
+                    </a:stretch>
+                  </pic:blipFill>
+                  <pic:spPr>
+                    <a:xfrm>
+                      <a:off x="0" y="0"/>
+                      <a:ext cx="3845560" cy="911225"/>
+                    </a:xfrm>
+                    <a:prstGeom prst="rect"/>
+                    <a:ln/>
+                  </pic:spPr>
+                </pic:pic>
+              </a:graphicData>
+            </a:graphic>
+          </wp:inline>
+        </w:drawing>
+      </w:r>
+      <w:r>
+        <w:rPr>
+          <w:rtl w:val="0"/>
+        </w:rPr>
       </w:r>
     </w:p>
     <w:p>
       <w:pPr>
-        <w:spacing w:after="160" w:before="0" w:line="240" w:lineRule="auto"/>
-        <w:ind w:left="0" w:right="0" w:firstLine="709"/>
-        <w:jc w:val="both"/>
-      </w:pPr>
-      <w:r>
-        <w:rPr>
-          <w:rFonts w:ascii="Times New Roman" w:hAnsi="Times New Roman"/>
-          <w:b w:val="0"/>
-          <w:i w:val="0"/>
-          <w:sz w:val="24"/>
-        </w:rPr>
-        <w:t>В случае если Заказчик или Представитель Заказчика считает проведение такого испытания необходимым, просим направить письменное требование с указанием основания (пункт Договора, проектной документации или технических условий). Подрядчик готов рассмотреть возможность его проведения по отдельному согласованию сроков и условий.</w:t>
-      </w:r>
-    </w:p>
-    <w:p>
-      <w:pPr>
-        <w:spacing w:after="40" w:before="0" w:line="240" w:lineRule="auto"/>
-        <w:ind w:left="0" w:right="0" w:firstLine="0"/>
-        <w:jc w:val="left"/>
-      </w:pPr>
-      <w:r>
-        <w:rPr>
-          <w:rFonts w:ascii="Times New Roman" w:hAnsi="Times New Roman"/>
-          <w:b w:val="0"/>
-          <w:i w:val="0"/>
-          <w:sz w:val="24"/>
-        </w:rPr>
-        <w:t>Приложения:</w:t>
-      </w:r>
-    </w:p>
-    <w:p>
-      <w:pPr>
-        <w:spacing w:after="0" w:before="0" w:line="240" w:lineRule="auto"/>
-        <w:ind w:left="283" w:right="0" w:firstLine="0"/>
-        <w:jc w:val="left"/>
-      </w:pPr>
-      <w:r>
-        <w:rPr>
-          <w:rFonts w:ascii="Times New Roman" w:hAnsi="Times New Roman"/>
-          <w:b w:val="0"/>
-          <w:i w:val="0"/>
-          <w:sz w:val="24"/>
-        </w:rPr>
-        <w:t>1. Копия протокола измерения сопротивления изоляции № ______ на ___ л.</w:t>
-      </w:r>
-    </w:p>
-    <w:p>
-      <w:pPr>
-        <w:spacing w:after="0" w:before="0" w:line="240" w:lineRule="auto"/>
-        <w:ind w:left="283" w:right="0" w:firstLine="0"/>
-        <w:jc w:val="left"/>
-      </w:pPr>
-      <w:r>
-        <w:rPr>
-          <w:rFonts w:ascii="Times New Roman" w:hAnsi="Times New Roman"/>
-          <w:b w:val="0"/>
-          <w:i w:val="0"/>
-          <w:sz w:val="24"/>
-        </w:rPr>
-        <w:t>2. Копия протокола измерения сопротивления № ______ на ___ л.</w:t>
-      </w:r>
-    </w:p>
-    <w:p>
-      <w:pPr>
-        <w:spacing w:after="0" w:before="0" w:line="240" w:lineRule="auto"/>
-        <w:ind w:left="283" w:right="0" w:firstLine="0"/>
-        <w:jc w:val="left"/>
-      </w:pPr>
-      <w:r>
-        <w:rPr>
-          <w:rFonts w:ascii="Times New Roman" w:hAnsi="Times New Roman"/>
-          <w:b w:val="0"/>
-          <w:i w:val="0"/>
-          <w:sz w:val="24"/>
-        </w:rPr>
-        <w:t>3. Копия свидетельства о поверке средств измерений на ___ л.</w:t>
-      </w:r>
-    </w:p>
-    <w:p>
-      <w:pPr>
-        <w:spacing w:after="200" w:before="0" w:line="240" w:lineRule="auto"/>
-        <w:ind w:left="0" w:right="0" w:firstLine="0"/>
-        <w:jc w:val="both"/>
-      </w:pPr>
-    </w:p>
-    <w:p>
-      <w:pPr>
+        <w:keepNext w:val="0"/>
+        <w:keepLines w:val="0"/>
+        <w:pageBreakBefore w:val="0"/>
+        <w:widowControl w:val="1"/>
+        <w:pBdr>
+          <w:top w:space="0" w:sz="0" w:val="nil"/>
+          <w:left w:space="0" w:sz="0" w:val="nil"/>
+          <w:bottom w:space="0" w:sz="0" w:val="nil"/>
+          <w:right w:space="0" w:sz="0" w:val="nil"/>
+          <w:between w:space="0" w:sz="0" w:val="nil"/>
+        </w:pBdr>
+        <w:shd w:fill="auto" w:val="clear"/>
         <w:spacing w:after="0" w:before="0" w:line="240" w:lineRule="auto"/>
         <w:ind w:left="0" w:right="0" w:firstLine="0"/>
         <w:jc w:val="left"/>
+        <w:rPr>
+          <w:rFonts w:ascii="Times New Roman" w:cs="Times New Roman" w:eastAsia="Times New Roman" w:hAnsi="Times New Roman"/>
+          <w:b w:val="0"/>
+          <w:bCs w:val="0"/>
+          <w:i w:val="0"/>
+          <w:iCs w:val="0"/>
+          <w:smallCaps w:val="0"/>
+          <w:strike w:val="0"/>
+          <w:color w:val="000000"/>
+          <w:sz w:val="24"/>
+          <w:szCs w:val="24"/>
+          <w:u w:val="none"/>
+          <w:shd w:fill="auto" w:val="clear"/>
+          <w:vertAlign w:val="baseline"/>
+        </w:rPr>
       </w:pPr>
       <w:r>
         <w:rPr>
-          <w:rFonts w:ascii="Times New Roman" w:hAnsi="Times New Roman"/>
-          <w:b w:val="0"/>
-          <w:i w:val="0"/>
-          <w:sz w:val="24"/>
-        </w:rPr>
-        <w:t>Генеральный директор</w:t>
-        <w:br/>
-        <w:t>ООО «ДИСИАЙ СОЛЮШНС»</w:t>
-        <w:tab/>
-        <w:tab/>
-        <w:tab/>
-        <w:tab/>
-        <w:tab/>
-        <w:t>_______________ / Л. В. Рамзес</w:t>
+          <w:rtl w:val="0"/>
+        </w:rPr>
       </w:r>
     </w:p>
     <w:sectPr>

</xml_diff>

<commit_message>
Use contract reference and date exactly as in source letter
Co-Authored-By: Claude Sonnet 5.5 <noreply@anthropic.com>
Claude-Session: https://claude.ai/code/session_01P2FNmuhyC2BfiSd8rbtRh4
</commit_message>
<xml_diff>
--- a/out/Информационное_письмо_об_испытаниях_72ч.docx
+++ b/out/Информационное_письмо_об_испытаниях_72ч.docx
@@ -74,7 +74,7 @@
           <w:szCs w:val="22"/>
           <w:rtl w:val="0"/>
         </w:rPr>
-        <w:t>Исх. № б/н от 15.10.2026 г.</w:t>
+        <w:t xml:space="preserve">Исх. № б/н от 05.10.2026 г.</w:t>
       </w:r>
     </w:p>
     <w:p>
@@ -302,7 +302,7 @@
           <w:szCs w:val="24"/>
           <w:rtl w:val="0"/>
         </w:rPr>
-        <w:t xml:space="preserve">1. Контракт и договор.</w:t>
+        <w:t xml:space="preserve">1. Государственный контракт № ГК-08-194/25 от 29.01.2026.</w:t>
       </w:r>
       <w:r>
         <w:rPr>
@@ -310,7 +310,7 @@
           <w:szCs w:val="24"/>
           <w:rtl w:val="0"/>
         </w:rPr>
-        <w:t xml:space="preserve"> Контракт и договорная документация по нему не устанавливают обязанность Подрядчика проводить испытание электроустановок под нагрузкой в течение 72 часов, а также критерии и порядок приёмки по его результатам.</w:t>
+        <w:t xml:space="preserve"> Контракт и документация к нему не устанавливают обязанность проводить испытание электроустановок под нагрузкой в течение 72 часов, а также критерии и порядок приёмки по его результатам.</w:t>
       </w:r>
     </w:p>
     <w:p>
@@ -331,7 +331,7 @@
           <w:szCs w:val="24"/>
           <w:rtl w:val="0"/>
         </w:rPr>
-        <w:t xml:space="preserve">2. Техническое задание (Приложение № 1 к договору).</w:t>
+        <w:t xml:space="preserve">2. Техническое задание.</w:t>
       </w:r>
       <w:r>
         <w:rPr>
@@ -437,7 +437,7 @@
           <w:szCs w:val="24"/>
           <w:rtl w:val="0"/>
         </w:rPr>
-        <w:t xml:space="preserve">На основании изложенного электроустановки Объекта испытаны в объёме, установленном Контрактом, Техническим заданием, ПМИ и действующими нормативными документами. Непроведение испытания под нагрузкой продолжительностью 72 часа не является нарушением условий выполнения работ. Если проведение такого испытания Вы считаете необходимым, просим направить письменное требование с указанием основания (пункт договора, проекта или технических условий); срок и условия его проведения будут согласованы дополнительно.</w:t>
+        <w:t xml:space="preserve">На основании изложенного электроустановки Объекта испытаны в объёме, установленном Государственным контрактом № ГК-08-194/25 от 29.01.2026, Техническим заданием, ПМИ и действующими нормативными документами. Непроведение испытания под нагрузкой продолжительностью 72 часа не является нарушением условий выполнения работ. Если проведение такого испытания Вы считаете необходимым, просим направить письменное требование с указанием основания (пункт контракта, проекта или технических условий); срок и условия его проведения будут согласованы дополнительно.</w:t>
       </w:r>
     </w:p>
     <w:p>

</xml_diff>

<commit_message>
Reference electrolab technical report 36/09 in letter
Co-Authored-By: Claude Sonnet 5.5 <noreply@anthropic.com>
Claude-Session: https://claude.ai/code/session_01P2FNmuhyC2BfiSd8rbtRh4
</commit_message>
<xml_diff>
--- a/out/Информационное_письмо_об_испытаниях_72ч.docx
+++ b/out/Информационное_письмо_об_испытаниях_72ч.docx
@@ -397,7 +397,7 @@
           <w:szCs w:val="24"/>
           <w:rtl w:val="0"/>
         </w:rPr>
-        <w:t xml:space="preserve"> Объём и нормы приёмо-сдаточных испытаний электроустановок напряжением до 1 кВ установлены главой 1.8 ПУЭ (7-е изд.) и приложением 3 к Правилам технической эксплуатации электроустановок потребителей (утв. приказом Минэнерго России от 12.08.2022 № 811). Они предусматривают, в частности, измерение сопротивления изоляции и проверку параметров цепи «фаза–нуль» (заземляющих устройств). Обязательного испытания таких электроустановок под нагрузкой в течение 72 часов указанные документы не устанавливают.</w:t>
+        <w:t xml:space="preserve"> Объём и нормы приёмо-сдаточных испытаний электроустановок напряжением до 1 кВ установлены главой 1.8 ПУЭ (7-е изд.), приложением 3 к Правилам технической эксплуатации электроустановок потребителей (утв. приказом Минэнерго России от 12.08.2022 № 811) и ГОСТ Р 50571.16-2019. Они предусматривают визуальный осмотр, проверку цепи между заземлителями и заземляемыми элементами и измерение сопротивления изоляции. Обязательного испытания таких электроустановок под нагрузкой в течение 72 часов указанные документы не устанавливают.</w:t>
       </w:r>
     </w:p>
     <w:p>
@@ -417,7 +417,7 @@
           <w:szCs w:val="24"/>
           <w:rtl w:val="0"/>
         </w:rPr>
-        <w:t xml:space="preserve">Выполненные испытания подтверждаются протоколами измерения сопротивления изоляции № ____ от __.__.2026 г. и измерения сопротивления № ____ от __.__.2026 г. (копии прилагаются); результаты соответствуют нормируемым значениям. Пусконаладочные работы на источниках бесперебойного питания проведены с применением резистивных нагрузочных модулей в соответствии с Техническим заданием.</w:t>
+        <w:t xml:space="preserve">Приёмо-сдаточные испытания электроустановки Объекта проведены 24.09.2026 электролабораторией ООО «Энерго Инжиниринг» (свидетельство о регистрации № 8558-2 от 24.05.2024) по программе, составленной в соответствии с ГОСТ Р 50571.16-2019. Результаты оформлены техническим отчётом № 36/09 (15 л.), в состав которого входят протоколы визуального осмотра (№ 1), проверки наличия цепи между заземлителями и заземляемыми элементами (№ 2) и проверки сопротивления изоляции проводов и кабелей (№ 3). По заключению лаборатории нарушений не выявлено, сопротивление переходных контактов в пределах нормы, мест с пониженным сопротивлением изоляции нет, электроустановка соответствует нормативной документации. Пусконаладочные работы на источниках бесперебойного питания проведены с применением резистивных нагрузочных модулей в соответствии с Техническим заданием.</w:t>
       </w:r>
     </w:p>
     <w:p>
@@ -457,7 +457,7 @@
           <w:szCs w:val="24"/>
           <w:rtl w:val="0"/>
         </w:rPr>
-        <w:t xml:space="preserve">Приложение: протоколы испытаний на ___ л. в 1 экз.</w:t>
+        <w:t xml:space="preserve">Приложение: технический отчёт электролаборатории № 36/09 (испытания от 24.09.2026) на 15 л. в 1 экз.</w:t>
       </w:r>
     </w:p>
     <w:p>

</xml_diff>

<commit_message>
Shorten letter: tech report attached, protocols not listed
Co-Authored-By: Claude Sonnet 5.5 <noreply@anthropic.com>
Claude-Session: https://claude.ai/code/session_01P2FNmuhyC2BfiSd8rbtRh4
</commit_message>
<xml_diff>
--- a/out/Информационное_письмо_об_испытаниях_72ч.docx
+++ b/out/Информационное_письмо_об_испытаниях_72ч.docx
@@ -417,7 +417,7 @@
           <w:szCs w:val="24"/>
           <w:rtl w:val="0"/>
         </w:rPr>
-        <w:t xml:space="preserve">Приёмо-сдаточные испытания электроустановки Объекта проведены 24.09.2026 электролабораторией ООО «Энерго Инжиниринг» (свидетельство о регистрации № 8558-2 от 24.05.2024) по программе, составленной в соответствии с ГОСТ Р 50571.16-2019. Результаты оформлены техническим отчётом № 36/09 (15 л.), в состав которого входят протоколы визуального осмотра (№ 1), проверки наличия цепи между заземлителями и заземляемыми элементами (№ 2) и проверки сопротивления изоляции проводов и кабелей (№ 3). По заключению лаборатории нарушений не выявлено, сопротивление переходных контактов в пределах нормы, мест с пониженным сопротивлением изоляции нет, электроустановка соответствует нормативной документации. Пусконаладочные работы на источниках бесперебойного питания проведены с применением резистивных нагрузочных модулей в соответствии с Техническим заданием.</w:t>
+        <w:t xml:space="preserve">Приёмо-сдаточные испытания электроустановки Объекта проведены электролабораторией ООО «Энерго Инжиниринг»; результаты оформлены техническим отчётом № 36/09, который прилагается к настоящему письму. Пусконаладочные работы на источниках бесперебойного питания проведены с применением резистивных нагрузочных модулей в соответствии с Техническим заданием.</w:t>
       </w:r>
     </w:p>
     <w:p>
@@ -457,7 +457,7 @@
           <w:szCs w:val="24"/>
           <w:rtl w:val="0"/>
         </w:rPr>
-        <w:t xml:space="preserve">Приложение: технический отчёт электролаборатории № 36/09 (испытания от 24.09.2026) на 15 л. в 1 экз.</w:t>
+        <w:t xml:space="preserve">Приложение: технический отчёт № 36/09 на 15 л. в 1 экз.</w:t>
       </w:r>
     </w:p>
     <w:p>

</xml_diff>